<commit_message>
Remove inclusive excellence section from teaching statement, expand roadmap pointer to diversity statement
Co-Authored-By: Claude Fable 5 <noreply@anthropic.com>
Claude-Session: https://claude.ai/code/session_01PiEg6Y7uKo8D9Ly2hNuxQc
</commit_message>
<xml_diff>
--- a/stony-brook-application/teaching-statement-highlighted-changes.docx
+++ b/stony-brook-application/teaching-statement-highlighted-changes.docx
@@ -17,7 +17,7 @@
           <w:i/>
           <w:sz w:val="18"/>
         </w:rPr>
-        <w:t>1. Added a closing roadmap to the introduction listing the five commitments in order of appearance, with a pointer to the diversity statement for inclusive excellence.</w:t>
+        <w:t>1. Removed the Advancing Inclusive Excellence section per your word-limit decision (a deletion, so it cannot be highlighted).</w:t>
       </w:r>
     </w:p>
     <w:p>
@@ -26,7 +26,7 @@
           <w:i/>
           <w:sz w:val="18"/>
         </w:rPr>
-        <w:t>2. Restored the sentence on first-generation, working, and caregiving students in Responsive Teaching (its original location).</w:t>
+        <w:t>2. Expanded the roadmap's second sentence so the five-commitment list still works without a dedicated section: it now says inclusive excellence runs through every section rather than standing alone, and that the diversity statement carries the detail (course design, accommodations, mentoring).</w:t>
       </w:r>
     </w:p>
     <w:p>
@@ -35,7 +35,7 @@
           <w:i/>
           <w:sz w:val="18"/>
         </w:rPr>
-        <w:t>3. Added a brief Advancing Inclusive Excellence section that synthesizes the inclusive-teaching content and directs readers to the diversity statement, where the full detail lives (kept short to avoid duplicating that document).</w:t>
+        <w:t>3. Everything else is unchanged from the version you approved, including the restored first-generation/working/caregiver sentence in Responsive Teaching, which keeps inclusive content visibly present in this document.</w:t>
       </w:r>
     </w:p>
     <w:p>
@@ -44,43 +44,7 @@
           <w:i/>
           <w:sz w:val="18"/>
         </w:rPr>
-        <w:t>4. Rewrote the unclear supervision sentence to state plainly that capstone advising is the same work as supervising graduate applied practice experiences, capstone projects, and theses.</w:t>
-      </w:r>
-    </w:p>
-    <w:p>
-      <w:r>
-        <w:rPr>
-          <w:i/>
-          <w:sz w:val="18"/>
-        </w:rPr>
-        <w:t>5. Rewrote the final-project passage to clarify the spectrum from most writing-intensive (literature review) to most quantitative (full data analysis), and reframed assignment design plus advising as mentorship, noting why this matters in master's-level courses.</w:t>
-      </w:r>
-    </w:p>
-    <w:p>
-      <w:r>
-        <w:rPr>
-          <w:i/>
-          <w:sz w:val="18"/>
-        </w:rPr>
-        <w:t>6. Fixed an accidental duplication in your edit: 'compared to mixed midterm responses, compared with mixed midterm responses' now appears once (a deletion, so it cannot be highlighted).</w:t>
-      </w:r>
-    </w:p>
-    <w:p>
-      <w:r>
-        <w:rPr>
-          <w:i/>
-          <w:sz w:val="18"/>
-        </w:rPr>
-        <w:t>7. The quantitative methods section stays removed per your instruction; its content is earmarked for the cover letter.</w:t>
-      </w:r>
-    </w:p>
-    <w:p>
-      <w:r>
-        <w:rPr>
-          <w:i/>
-          <w:sz w:val="18"/>
-        </w:rPr>
-        <w:t>Word count: 1,450 including title and headings (about 1,415 words of prose), references excluded.</w:t>
+        <w:t>Word count: 1,350 including title and headings (about 1,320 words of prose), references excluded.</w:t>
       </w:r>
     </w:p>
     <w:p/>
@@ -100,13 +64,13 @@
     </w:p>
     <w:p>
       <w:r>
-        <w:t xml:space="preserve">Over the years at UC Irvine, I have put this philosophy into practice with more than 500 students across in-person, hybrid, and online asynchronous formats. I have served as instructor of record for lower- and upper-division public health courses, teaching assistant (TA) for six courses from honors seminars to large introductory classes, facilitator training 27 incoming graduate TAs in the health sciences, and now Educational Development Scholar supporting new instructors. My year-long training as a Pedagogical Scholar also deepened this evidence-based practice. The results are measurable: in my most recent course, 84% of students rated my overall teaching as 9/9, with metrics averaging 8.78/9 across all dimensions. My doctoral training and quantitative expertise prepare me to teach across the graduate public health curriculum, from biostatistics, epidemiology, data analytics, and research methods to health disparities, environmental health, community health, and health policy. </w:t>
+        <w:t xml:space="preserve">Over the years at UC Irvine, I have put this philosophy into practice with more than 500 students across in-person, hybrid, and online asynchronous formats. I have served as instructor of record for lower- and upper-division public health courses, teaching assistant (TA) for six courses from honors seminars to large introductory classes, facilitator training 27 incoming graduate TAs in the health sciences, and now Educational Development Scholar supporting new instructors. My year-long training as a Pedagogical Scholar also deepened this evidence-based practice. The results are measurable: in my most recent course, 84% of students rated my overall teaching as 9/9, with metrics averaging 8.78/9 across all dimensions. My doctoral training and quantitative expertise prepare me to teach across the graduate public health curriculum, from biostatistics, epidemiology, data analytics, and research methods to health disparities, environmental health, community health, and health policy. This statement describes my approach through five connected commitments: creating engaging learning environments, responsive teaching, advancing inclusive excellence, mentoring future public health professionals, and developing fellow educators. </w:t>
       </w:r>
       <w:r>
         <w:rPr>
           <w:highlight w:val="yellow"/>
         </w:rPr>
-        <w:t>This statement describes my approach through five connected commitments: creating engaging learning environments, responsive teaching, advancing inclusive excellence, mentoring future public health professionals, and developing fellow educators. Because my diversity statement explores inclusive excellence in depth, I keep that section brief here.</w:t>
+        <w:t>Inclusive excellence runs through every section that follows rather than standing alone: because it anchors my diversity statement, I detail there the inclusive course design, accommodations, and mentoring commitments behind it.</w:t>
       </w:r>
     </w:p>
     <w:p>
@@ -139,34 +103,7 @@
     </w:p>
     <w:p>
       <w:r>
-        <w:t xml:space="preserve">Effective teaching requires systematic assessment and adaptation. Drawing on my Pedagogical Scholar training, I center assessment for learning over assessment of learning. I administer pre-course surveys to understand students' backgrounds and barriers, enabling differentiated instruction, and midterm evaluations for timely feedback. For example, when midterm responses called for earlier materials and clearer final-project instructions, I revised the guidelines, posted materials sooner, and added in-class work sessions with real-time feedback. When students noted fast pacing, I slowed transitions and built in consolidation pauses. These modifications resulted in 74% rating presentations and explanations as 9/9 in final evaluations compared to mixed midterm responses. These practices extend across modalities and instructional teams. Teaching an online asynchronous course with 78 students, I coordinated a three-person instructional team through weekly meetings, collaboratively built detailed Canvas rubrics for consistent grading and feedback, and monitored progress closely. Because online formats can obscure struggling students, I proactively checked performance and held one-on-one Zoom meetings early. </w:t>
-      </w:r>
-      <w:r>
-        <w:rPr>
-          <w:highlight w:val="yellow"/>
-        </w:rPr>
-        <w:t xml:space="preserve">This work also deepened my insight into first-generation college students navigating academic systems without family guidance, students balancing employment, and caregivers managing family responsibilities. </w:t>
-      </w:r>
-      <w:r>
-        <w:t>Designing assessments aligned with explicit learning outcomes prepares me to contribute to competency-based curricula and CEPH assessment requirements. I treat every course as a chance to listen, adjust, and teach better than the term before, pursuing continuing professional development through workshops, teaching communities, and pedagogical scholarship.</w:t>
-      </w:r>
-    </w:p>
-    <w:p>
-      <w:r>
-        <w:rPr>
-          <w:b/>
-          <w:sz w:val="24"/>
-          <w:highlight w:val="yellow"/>
-        </w:rPr>
-        <w:t>Advancing Inclusive Excellence</w:t>
-      </w:r>
-    </w:p>
-    <w:p>
-      <w:r>
-        <w:rPr>
-          <w:highlight w:val="yellow"/>
-        </w:rPr>
-        <w:t>These insights make inclusion a design requirement rather than an afterthought. I build courses that offer more than one route to success, combining flexible structures with individual problem-solving when a student's circumstances change, so that life demands, learning styles, and resource access never determine who can excel. Students have credited this approach with creating an equitable environment and protecting their mental health alongside their learning, reflecting the pedagogical wellness at the center of my philosophy. I treat barriers to learning the way public health treats barriers to health: as structural conditions to redesign, not personal deficits to overcome. My diversity statement details the specific practices, accommodations, and mentoring commitments behind this work.</w:t>
+        <w:t>Effective teaching requires systematic assessment and adaptation. Drawing on my Pedagogical Scholar training, I center assessment for learning over assessment of learning. I administer pre-course surveys to understand students' backgrounds and barriers, enabling differentiated instruction, and midterm evaluations for timely feedback. For example, when midterm responses called for earlier materials and clearer final-project instructions, I revised the guidelines, posted materials sooner, and added in-class work sessions with real-time feedback. When students noted fast pacing, I slowed transitions and built in consolidation pauses. These modifications resulted in 74% rating presentations and explanations as 9/9 in final evaluations compared to mixed midterm responses. These practices extend across modalities and instructional teams. Teaching an online asynchronous course with 78 students, I coordinated a three-person instructional team through weekly meetings, collaboratively built detailed Canvas rubrics for consistent grading and feedback, and monitored progress closely. Because online formats can obscure struggling students, I proactively checked performance and held one-on-one Zoom meetings early. This work also deepened my insight into first-generation college students navigating academic systems without family guidance, students balancing employment, and caregivers managing family responsibilities. Designing assessments aligned with explicit learning outcomes prepares me to contribute to competency-based curricula and CEPH assessment requirements. I treat every course as a chance to listen, adjust, and teach better than the term before, pursuing continuing professional development through workshops, teaching communities, and pedagogical scholarship.</w:t>
       </w:r>
     </w:p>
     <w:p>
@@ -180,16 +117,7 @@
     </w:p>
     <w:p>
       <w:r>
-        <w:t xml:space="preserve">Inside and outside the classroom, I mentor students through academic and professional development. As TA for the Public Health Honors Seminar and Thesis across multiple quarters and now as a graduate mentor, I have guided students through every stage of their capstone research projects, from research design and methodology selection through data analysis and scholarly presentation. </w:t>
-      </w:r>
-      <w:r>
-        <w:rPr>
-          <w:highlight w:val="yellow"/>
-        </w:rPr>
-        <w:t xml:space="preserve">Guiding a student from an initial question to a finished, defended product is the same work that supervising graduate applied practice experiences, capstone projects, and theses requires, and I am ready to bring that step-by-step advising to master's students. In my own courses, assignment design becomes a mentoring tool. In Social Epidemiology, students chose from three final project options that run from the most writing-intensive to the most quantitative: a literature review, a research proposal, or a full data analysis. I advise each student toward the option that best serves their career goals, an approach I consider essential in master's-level courses, where assignments should build directly toward professional needs. </w:t>
-      </w:r>
-      <w:r>
-        <w:t>One wrote that the group research project “could be helpful in the future career when I need to create my own research project.” In addition, this mentorship reshapes trajectories: several students entered public health graduate programs after working with me. One wrote that my course “had a profound impact” and “helped solidify my decision to pursue a graduate degree in public health,” adding that our discussions “helped me discover an area I feel deeply passionate about.” Another, from a non-public health background, said my course “shaped my academic and professional interests.” My career advising draws on practice experience: nearly three years as a Data and Policy Analyst developing Medicare cost measures for the Centers for Medicare and Medicaid Services, service as Coordinator of the Applied Public Health Statistics Section of the American Public Health Association, and more than $90,000 in competitive funding, including an American Heart Association Fellowship. I use this background to coach students on grant development, from specific aims to budget justification, and on the full range of public health careers.</w:t>
+        <w:t>Inside and outside the classroom, I mentor students through academic and professional development. As TA for the Public Health Honors Seminar and Thesis across multiple quarters and now as a graduate mentor, I have guided students through every stage of their capstone research projects, from research design and methodology selection through data analysis and scholarly presentation. Guiding a student from an initial question to a finished, defended product is the same work that supervising graduate applied practice experiences, capstone projects, and theses requires, and I am ready to bring that step-by-step advising to master's students. In my own courses, assignment design becomes a mentoring tool. In Social Epidemiology, students chose from three final project options that run from the most writing-intensive to the most quantitative: a literature review, a research proposal, or a full data analysis. I advise each student toward the option that best serves their career goals, an approach I consider essential in master's-level courses, where assignments should build directly toward professional needs. One wrote that the group research project “could be helpful in the future career when I need to create my own research project.” In addition, this mentorship reshapes trajectories: several students entered public health graduate programs after working with me. One wrote that my course “had a profound impact” and “helped solidify my decision to pursue a graduate degree in public health,” adding that our discussions “helped me discover an area I feel deeply passionate about.” Another, from a non-public health background, said my course “shaped my academic and professional interests.” My career advising draws on practice experience: nearly three years as a Data and Policy Analyst developing Medicare cost measures for the Centers for Medicare and Medicaid Services, service as Coordinator of the Applied Public Health Statistics Section of the American Public Health Association, and more than $90,000 in competitive funding, including an American Heart Association Fellowship. I use this background to coach students on grant development, from specific aims to budget justification, and on the full range of public health careers.</w:t>
       </w:r>
     </w:p>
     <w:p>

</xml_diff>